<commit_message>
Update data files: merged submissions, schedule, intro text
Co-Authored-By: Claude Sonnet 4.6 <noreply@anthropic.com>
</commit_message>
<xml_diff>
--- a/data/intro.html.docx
+++ b/data/intro.html.docx
@@ -10,35 +10,49 @@
         <w:t>kommen</w:t>
       </w:r>
       <w:r>
-        <w:t xml:space="preserve"> Forschende der Archäologie Afrikas in Frankfurt zusammen. Ziel ist es, das im Rahmen des SPP „</w:t>
-      </w:r>
-      <w:proofErr w:type="spellStart"/>
-      <w:r>
-        <w:t>Entangled</w:t>
-      </w:r>
-      <w:proofErr w:type="spellEnd"/>
-      <w:r>
-        <w:t xml:space="preserve"> </w:t>
-      </w:r>
-      <w:proofErr w:type="spellStart"/>
-      <w:r>
-        <w:t>Africa</w:t>
-      </w:r>
-      <w:proofErr w:type="spellEnd"/>
-      <w:r>
-        <w:t xml:space="preserve">" entstandene Netzwerk zu erhalten, neue Kontakte zu ermöglichen und die Forschung zur afrikanischen Archäologie zu fördern. Beiträge sind in </w:t>
-      </w:r>
-      <w:r>
-        <w:t>zwei</w:t>
-      </w:r>
-      <w:r>
-        <w:t xml:space="preserve"> Formaten vorgesehen</w:t>
-      </w:r>
-      <w:r>
-        <w:t>:</w:t>
-      </w:r>
-      <w:r>
-        <w:t xml:space="preserve"> Präsentationen zur Vorstellung von Forschungsvorhaben und Ergebnissen sowie Runde Tische, bei denen in einem kurzen Impulsvortrag eine Herausforderung oder offene Frage aus dem eigenen Forschungsfeld präsentiert und anschließend gemeinsam diskutiert wird. Die folgenden Abstracts geben einen Überblick über die Beiträge des Treffens.</w:t>
+        <w:t xml:space="preserve"> Forschende der Archäologie Afrikas in Frankfurt zusammen. Ziel ist es</w:t>
+      </w:r>
+      <w:r>
+        <w:t xml:space="preserve"> Forschende zu vernetzen</w:t>
+      </w:r>
+      <w:r>
+        <w:t xml:space="preserve">, neue Kontakte zu ermöglichen und die Forschung zur afrikanischen Archäologie zu fördern. </w:t>
+      </w:r>
+      <w:r>
+        <w:t>Zuerst werden</w:t>
+      </w:r>
+      <w:r>
+        <w:t xml:space="preserve"> Forschungsvorhaben und Ergebnisse</w:t>
+      </w:r>
+      <w:r>
+        <w:t xml:space="preserve"> in Präsentationen vorgestellt. Anschließend wollen wir an einem</w:t>
+      </w:r>
+      <w:r>
+        <w:t xml:space="preserve"> Runde</w:t>
+      </w:r>
+      <w:r>
+        <w:t>n</w:t>
+      </w:r>
+      <w:r>
+        <w:t xml:space="preserve"> Tisch</w:t>
+      </w:r>
+      <w:r>
+        <w:t>, das Thema „Archäometrie in der Afrika-Archäologie“ diskutieren</w:t>
+      </w:r>
+      <w:r>
+        <w:t xml:space="preserve">. </w:t>
+      </w:r>
+      <w:r>
+        <w:t xml:space="preserve">Zum Abschluss würden wir uns freuen gemeinsam den </w:t>
+      </w:r>
+      <w:r>
+        <w:t xml:space="preserve">Tag im Biergarten ausklingen zu lassen. </w:t>
+      </w:r>
+      <w:r>
+        <w:t>Die folgenden Abstracts geben einen Überblick über die Beiträge</w:t>
+      </w:r>
+      <w:r>
+        <w:t>. Wir freuen uns auf euch.</w:t>
       </w:r>
     </w:p>
     <w:sectPr>
@@ -654,6 +668,7 @@
   <w:style w:type="character" w:default="1" w:styleId="Absatz-Standardschriftart">
     <w:name w:val="Default Paragraph Font"/>
     <w:uiPriority w:val="1"/>
+    <w:semiHidden/>
     <w:unhideWhenUsed/>
   </w:style>
   <w:style w:type="table" w:default="1" w:styleId="NormaleTabelle">

</xml_diff>

<commit_message>
Sync intro text (DE/EN) with updated intro.html.docx
intro.html.docx is the DE source of truth (auto-converted at build time);
the EN site read from a stale intro-en.html that had drifted out of sync.
Also refreshed the unused-but-tracked intro.html/intro-de.html fallbacks
so they don't mislead anyone reading them later.

Co-Authored-By: Claude Sonnet 5 <noreply@anthropic.com>
</commit_message>
<xml_diff>
--- a/data/intro.html.docx
+++ b/data/intro.html.docx
@@ -4,57 +4,41 @@
   <w:body>
     <w:p>
       <w:r>
-        <w:t xml:space="preserve">Am 4. September 2026 </w:t>
+        <w:t>Am 4. September 2026 kommen Forschende der Archäologie Afrikas in Frankfurt zusammen. Ziel ist es, das im Rahmen des SPP „</w:t>
+      </w:r>
+      <w:proofErr w:type="spellStart"/>
+      <w:r>
+        <w:t>Entangled</w:t>
+      </w:r>
+      <w:proofErr w:type="spellEnd"/>
+      <w:r>
+        <w:t xml:space="preserve"> </w:t>
+      </w:r>
+      <w:proofErr w:type="spellStart"/>
+      <w:r>
+        <w:t>Africa</w:t>
+      </w:r>
+      <w:proofErr w:type="spellEnd"/>
+      <w:r>
+        <w:t xml:space="preserve">" entstandene Netzwerk zu erhalten, neue Kontakte zu ermöglichen und die Forschung zur afrikanischen Archäologie zu fördern. </w:t>
       </w:r>
       <w:r>
-        <w:t>kommen</w:t>
+        <w:t xml:space="preserve">Es wird 3 Sessions mit Präsentationen von verschiedenen Forschenden geben. Abschließend wollen wir uns in einem gemeinsamen </w:t>
+      </w:r>
+      <w:proofErr w:type="spellStart"/>
+      <w:r>
+        <w:t>Roundtable</w:t>
+      </w:r>
+      <w:proofErr w:type="spellEnd"/>
+      <w:r>
+        <w:t xml:space="preserve"> zum Thema Archäometrie in der Archäologie Afrikas austauschen.</w:t>
       </w:r>
       <w:r>
-        <w:t xml:space="preserve"> Forschende der Archäologie Afrikas in Frankfurt zusammen. Ziel ist es</w:t>
-      </w:r>
-      <w:r>
-        <w:t xml:space="preserve"> Forschende zu vernetzen</w:t>
-      </w:r>
-      <w:r>
-        <w:t xml:space="preserve">, neue Kontakte zu ermöglichen und die Forschung zur afrikanischen Archäologie zu fördern. </w:t>
-      </w:r>
-      <w:r>
-        <w:t>Zuerst werden</w:t>
-      </w:r>
-      <w:r>
-        <w:t xml:space="preserve"> Forschungsvorhaben und Ergebnisse</w:t>
-      </w:r>
-      <w:r>
-        <w:t xml:space="preserve"> in Präsentationen vorgestellt. Anschließend wollen wir an einem</w:t>
-      </w:r>
-      <w:r>
-        <w:t xml:space="preserve"> Runde</w:t>
-      </w:r>
-      <w:r>
-        <w:t>n</w:t>
-      </w:r>
-      <w:r>
-        <w:t xml:space="preserve"> Tisch</w:t>
-      </w:r>
-      <w:r>
-        <w:t>, das Thema „Archäometrie in der Afrika-Archäologie“ diskutieren</w:t>
-      </w:r>
-      <w:r>
-        <w:t xml:space="preserve">. </w:t>
-      </w:r>
-      <w:r>
-        <w:t xml:space="preserve">Zum Abschluss würden wir uns freuen gemeinsam den </w:t>
-      </w:r>
-      <w:r>
-        <w:t xml:space="preserve">Tag im Biergarten ausklingen zu lassen. </w:t>
-      </w:r>
-      <w:r>
-        <w:t>Die folgenden Abstracts geben einen Überblick über die Beiträge</w:t>
-      </w:r>
-      <w:r>
-        <w:t>. Wir freuen uns auf euch.</w:t>
+        <w:t xml:space="preserve"> Die folgenden Abstracts geben einen Überblick über die Beiträge des Treffens. </w:t>
       </w:r>
     </w:p>
+    <w:p/>
+    <w:p/>
     <w:sectPr>
       <w:pgSz w:w="11906" w:h="16838"/>
       <w:pgMar w:top="1417" w:right="1417" w:bottom="1134" w:left="1417" w:header="708" w:footer="708" w:gutter="0"/>
@@ -493,7 +477,6 @@
     <w:next w:val="Standard"/>
     <w:link w:val="berschrift2Zchn"/>
     <w:uiPriority w:val="9"/>
-    <w:semiHidden/>
     <w:unhideWhenUsed/>
     <w:qFormat/>
     <w:rsid w:val="004F4EE9"/>
@@ -668,7 +651,6 @@
   <w:style w:type="character" w:default="1" w:styleId="Absatz-Standardschriftart">
     <w:name w:val="Default Paragraph Font"/>
     <w:uiPriority w:val="1"/>
-    <w:semiHidden/>
     <w:unhideWhenUsed/>
   </w:style>
   <w:style w:type="table" w:default="1" w:styleId="NormaleTabelle">
@@ -710,7 +692,6 @@
     <w:basedOn w:val="Absatz-Standardschriftart"/>
     <w:link w:val="berschrift2"/>
     <w:uiPriority w:val="9"/>
-    <w:semiHidden/>
     <w:rsid w:val="004F4EE9"/>
     <w:rPr>
       <w:rFonts w:asciiTheme="majorHAnsi" w:eastAsiaTheme="majorEastAsia" w:hAnsiTheme="majorHAnsi" w:cstheme="majorBidi"/>
@@ -980,6 +961,17 @@
       <w:smallCaps/>
       <w:color w:val="2E74B5" w:themeColor="accent1" w:themeShade="BF"/>
       <w:spacing w:val="5"/>
+    </w:rPr>
+  </w:style>
+  <w:style w:type="character" w:styleId="Hyperlink">
+    <w:name w:val="Hyperlink"/>
+    <w:basedOn w:val="Absatz-Standardschriftart"/>
+    <w:uiPriority w:val="99"/>
+    <w:unhideWhenUsed/>
+    <w:rsid w:val="002C6EC3"/>
+    <w:rPr>
+      <w:color w:val="0563C1" w:themeColor="hyperlink"/>
+      <w:u w:val="single"/>
     </w:rPr>
   </w:style>
 </w:styles>

</xml_diff>